<commit_message>
vault backup: 2026-07-07 01:09:59
</commit_message>
<xml_diff>
--- a/Investigare/png notevoli/Scheda_PNG_01_Taniguchi_Kenji.docx
+++ b/Investigare/png notevoli/Scheda_PNG_01_Taniguchi_Kenji.docx
@@ -250,7 +250,7 @@
           <w:color w:val="1A1A2E"/>
           <w:sz w:val="16"/>
         </w:rPr>
-        <w:t>Keibu (警部) — Commissario</w:t>
+        <w:t>Keishi (警視) — Commissario</w:t>
       </w:r>
       <w:r>
         <w:rPr>
@@ -1064,7 +1064,7 @@
           <w:color w:val="787878"/>
           <w:sz w:val="18"/>
         </w:rPr>
-        <w:t>La tua presenza diventa schiacciante. Il PNG sente il peso della tua autorità.</w:t>
+        <w:t>Esplosione di autorità in un momento preciso. Una frase, uno sguardo. Interruzione totale.</w:t>
       </w:r>
     </w:p>
     <w:p>
@@ -1120,7 +1120,7 @@
           <w:color w:val="8B0000"/>
           <w:sz w:val="16"/>
         </w:rPr>
-        <w:t>2 Ki</w:t>
+        <w:t>3 Ki</w:t>
       </w:r>
     </w:p>
     <w:p>
@@ -1146,7 +1146,7 @@
           <w:color w:val="1A1A2E"/>
           <w:sz w:val="16"/>
         </w:rPr>
-        <w:t>Il PNG è completamente sottomesso, cede o si ritira</w:t>
+        <w:t>Il PNG si ferma — qualche secondo di sottomissione assoluta, perde il filo</w:t>
       </w:r>
     </w:p>
     <w:p>
@@ -1172,7 +1172,7 @@
           <w:color w:val="1A1A2E"/>
           <w:sz w:val="16"/>
         </w:rPr>
-        <w:t>Il PNG è intimidito e scosso, ma non cede completamente</w:t>
+        <w:t>Il PNG esita, perde il filo per un istante</w:t>
       </w:r>
     </w:p>
     <w:p>

</xml_diff>